<commit_message>
add messages for errors & single zip output
</commit_message>
<xml_diff>
--- a/example_files/тест.docx
+++ b/example_files/тест.docx
@@ -10,11 +10,36 @@
       </w:pPr>
       <w:r>
         <w:rPr>
+          <w:b/>
+          <w:bCs/>
           <w:lang w:val="en-US"/>
         </w:rPr>
-        <w:t>{{DATA}}</w:t>
+        <w:t>{{</w:t>
+      </w:r>
+      <w:r>
+        <w:rPr>
+          <w:b/>
+          <w:bCs/>
+          <w:lang w:val="en-US"/>
+        </w:rPr>
+        <w:t>1_</w:t>
+      </w:r>
+      <w:r>
+        <w:rPr>
+          <w:b/>
+          <w:bCs/>
+          <w:lang w:val="en-US"/>
+        </w:rPr>
+        <w:t>DATA}</w:t>
+      </w:r>
+      <w:r>
+        <w:rPr>
+          <w:lang w:val="en-US"/>
+        </w:rPr>
+        <w:t>}</w:t>
       </w:r>
     </w:p>
+    <w:p/>
     <w:sectPr>
       <w:pgSz w:w="11906" w:h="16838"/>
       <w:pgMar w:top="1134" w:right="850" w:bottom="1134" w:left="1701" w:header="708" w:footer="708" w:gutter="0"/>

</xml_diff>